<commit_message>
docs: nombre exacto del programa en los informes de servicio social
'Desarrollo de plataforma movil para un sistema de navegacion autonoma,
Rosmaster X3', segun el estudiante; en caratula e introduccion.

Co-Authored-By: Claude Opus 5.5 <noreply@anthropic.com>
Claude-Session: https://claude.ai/code/session_01KTU6LYCZD859uAg5BHVvk4
</commit_message>
<xml_diff>
--- a/docs/entrega/informe-servicio-social-andros-toscano.docx
+++ b/docs/entrega/informe-servicio-social-andros-toscano.docx
@@ -171,7 +171,7 @@
           <w:i w:val="0"/>
           <w:sz w:val="26"/>
         </w:rPr>
-        <w:t>Desarrollo de un sistema de navegación autónoma para plataforma móvil Rosmaster X3</w:t>
+        <w:t>Desarrollo de plataforma móvil para un sistema de navegación autónoma, Rosmaster X3</w:t>
       </w:r>
     </w:p>
     <w:p>
@@ -502,7 +502,7 @@
           <w:i/>
           <w:sz w:val="24"/>
         </w:rPr>
-        <w:t>Desarrollo de un sistema de navegación autónoma para plataforma móvil Rosmaster X3</w:t>
+        <w:t>Desarrollo de plataforma móvil para un sistema de navegación autónoma, Rosmaster X3</w:t>
       </w:r>
       <w:r>
         <w:rPr>

</xml_diff>